<commit_message>
docs(c1a-g2): dàn lại dòng hai câu sửa ICF/DMP để dòng nối bắt đầu bằng chữ thường — nút Chot G2 hiện trọn câu
Nút Chot G2 hiện ngữ cảnh khi dòng mang nhãn [BÁC SĨ RÀ] là phần nối của câu (chữ thường/chữ số/«(»); hai câu ngắt
trước chữ IN HOA («KIỂM SOÁT», «TÁCH BIỆT») bị hiện cụt khi diễn tập. Nội dung không đổi (chỉ chữ hoa → thường ở
phần nối «giả danh hóa có kiểm soát», «tách biệt»).

Co-Authored-By: Claude Opus 5.5 <noreply@anthropic.com>
</commit_message>
<xml_diff>
--- a/exports/hai-long-benh-nhan-C1a-BVQY175/G2_A3_ETHICS_PACKAGE_hai-long-benh-nhan-C1a-BVQY175.docx
+++ b/exports/hai-long-benh-nhan-C1a-BVQY175/G2_A3_ETHICS_PACKAGE_hai-long-benh-nhan-C1a-BVQY175.docx
@@ -3390,37 +3390,37 @@
           <w:i w:val="0"/>
           <w:sz w:val="26"/>
         </w:rPr>
-        <w:t>Dữ liệu nhận dạng: phiếu KHÔNG ghi thông tin định danh; thời gian chờ được ghép theo cách GIẢ DANH HÓA CÓ</w:t>
-      </w:r>
-    </w:p>
-    <w:p>
-      <w:pPr>
-        <w:spacing w:before="0" w:after="160" w:lineRule="auto" w:line="360"/>
-        <w:jc w:val="both"/>
-      </w:pPr>
-      <w:r>
-        <w:rPr>
-          <w:rFonts w:ascii="Times New Roman" w:hAnsi="Times New Roman" w:eastAsia="Times New Roman" w:cs="Times New Roman"/>
-          <w:b w:val="0"/>
-          <w:i w:val="0"/>
-          <w:sz w:val="26"/>
-        </w:rPr>
-        <w:t>KIỂM SOÁT — bảng đối chiếu HIS nêu trên là liên kết duy nhất về lượt khám, do CNTT/QLCL giữ và huỷ trong</w:t>
-      </w:r>
-    </w:p>
-    <w:p>
-      <w:pPr>
-        <w:spacing w:before="0" w:after="160" w:lineRule="auto" w:line="360"/>
-        <w:jc w:val="both"/>
-      </w:pPr>
-      <w:r>
-        <w:rPr>
-          <w:rFonts w:ascii="Times New Roman" w:hAnsi="Times New Roman" w:eastAsia="Times New Roman" w:cs="Times New Roman"/>
-          <w:b w:val="0"/>
-          <w:i w:val="0"/>
-          <w:sz w:val="26"/>
-        </w:rPr>
-        <w:t xml:space="preserve">30 ngày </w:t>
+        <w:t>Dữ liệu nhận dạng: phiếu KHÔNG ghi thông tin định danh; thời gian chờ được ghép theo cách</w:t>
+      </w:r>
+    </w:p>
+    <w:p>
+      <w:pPr>
+        <w:spacing w:before="0" w:after="160" w:lineRule="auto" w:line="360"/>
+        <w:jc w:val="both"/>
+      </w:pPr>
+      <w:r>
+        <w:rPr>
+          <w:rFonts w:ascii="Times New Roman" w:hAnsi="Times New Roman" w:eastAsia="Times New Roman" w:cs="Times New Roman"/>
+          <w:b w:val="0"/>
+          <w:i w:val="0"/>
+          <w:sz w:val="26"/>
+        </w:rPr>
+        <w:t>giả danh hóa có kiểm soát — bảng đối chiếu HIS nêu trên là liên kết duy nhất về lượt khám, do CNTT/QLCL giữ</w:t>
+      </w:r>
+    </w:p>
+    <w:p>
+      <w:pPr>
+        <w:spacing w:before="0" w:after="160" w:lineRule="auto" w:line="360"/>
+        <w:jc w:val="both"/>
+      </w:pPr>
+      <w:r>
+        <w:rPr>
+          <w:rFonts w:ascii="Times New Roman" w:hAnsi="Times New Roman" w:eastAsia="Times New Roman" w:cs="Times New Roman"/>
+          <w:b w:val="0"/>
+          <w:i w:val="0"/>
+          <w:sz w:val="26"/>
+        </w:rPr>
+        <w:t xml:space="preserve">và huỷ trong 30 ngày </w:t>
       </w:r>
       <w:r>
         <w:rPr>
@@ -5189,22 +5189,22 @@
           <w:i w:val="0"/>
           <w:sz w:val="26"/>
         </w:rPr>
-        <w:t>Phương pháp: GIẢ DANH HÓA CÓ KIỂM SOÁT — phiếu KHÔNG có ô định danh, chỉ mang mã nghiên cứu; phiếu đồng ý (ICF) ký tên lưu</w:t>
-      </w:r>
-    </w:p>
-    <w:p>
-      <w:pPr>
-        <w:spacing w:before="0" w:after="160" w:lineRule="auto" w:line="360"/>
-        <w:jc w:val="both"/>
-      </w:pPr>
-      <w:r>
-        <w:rPr>
-          <w:rFonts w:ascii="Times New Roman" w:hAnsi="Times New Roman" w:eastAsia="Times New Roman" w:cs="Times New Roman"/>
-          <w:b w:val="0"/>
-          <w:i w:val="0"/>
-          <w:sz w:val="26"/>
-        </w:rPr>
-        <w:t xml:space="preserve">TÁCH BIỆT vật lý, không ghép với phiếu (đề cương §4.11) </w:t>
+        <w:t>Phương pháp: GIẢ DANH HÓA CÓ KIỂM SOÁT — phiếu KHÔNG có ô định danh, chỉ mang mã nghiên cứu; phiếu</w:t>
+      </w:r>
+    </w:p>
+    <w:p>
+      <w:pPr>
+        <w:spacing w:before="0" w:after="160" w:lineRule="auto" w:line="360"/>
+        <w:jc w:val="both"/>
+      </w:pPr>
+      <w:r>
+        <w:rPr>
+          <w:rFonts w:ascii="Times New Roman" w:hAnsi="Times New Roman" w:eastAsia="Times New Roman" w:cs="Times New Roman"/>
+          <w:b w:val="0"/>
+          <w:i w:val="0"/>
+          <w:sz w:val="26"/>
+        </w:rPr>
+        <w:t xml:space="preserve">đồng ý (ICF) ký tên lưu tách biệt vật lý, không ghép với phiếu (đề cương §4.11) </w:t>
       </w:r>
       <w:r>
         <w:rPr>

</xml_diff>

<commit_message>
docs(c1a-g2): PI ghi ngày tra đăng ký trong nước — G2 READY_FOR_IRB_SUBMISSION
Ô cuối G2-AUTO-05 trước khi nộp: «đăng ký trong nước: 2026-10-14» (PI gõ qua nút). Chấm sống G2 14/16 —
còn 2 mục của Hội đồng Đạo đức (G2-HUMAN-01/02).

Cần bác sĩ kiểm chứng.

Co-Authored-By: Claude Opus 5.5 <noreply@anthropic.com>
</commit_message>
<xml_diff>
--- a/exports/hai-long-benh-nhan-C1a-BVQY175/G2_A3_ETHICS_PACKAGE_hai-long-benh-nhan-C1a-BVQY175.docx
+++ b/exports/hai-long-benh-nhan-C1a-BVQY175/G2_A3_ETHICS_PACKAGE_hai-long-benh-nhan-C1a-BVQY175.docx
@@ -6957,17 +6957,7 @@
           <w:i/>
           <w:sz w:val="22"/>
         </w:rPr>
-        <w:t xml:space="preserve">hệ thống không tra được hai nguồn đầu vì không có API mở. WHO ICTRP: PI đã tự tra 2026-10-11, không thấy nghiên cứu trùng (ghi ở G0); PROSPERO: không áp dụng (không phải tổng quan hệ thống); đăng ký trong nước: </w:t>
-      </w:r>
-      <w:r>
-        <w:rPr>
-          <w:rFonts w:ascii="Times New Roman" w:hAnsi="Times New Roman" w:eastAsia="Times New Roman" w:cs="Times New Roman"/>
-          <w:b/>
-          <w:i/>
-          <w:color w:val="CC7700"/>
-          <w:sz w:val="22"/>
-        </w:rPr>
-        <w:t>[CẦN BÁC SĨ TỰ TRA]</w:t>
+        <w:t>hệ thống không tra được hai nguồn đầu vì không có API mở. WHO ICTRP: PI đã tự tra 2026-10-11, không thấy nghiên cứu trùng (ghi ở G0); PROSPERO: không áp dụng (không phải tổng quan hệ thống); đăng ký trong nước: 2026-10-14</w:t>
       </w:r>
     </w:p>
     <w:p>

</xml_diff>